<commit_message>
inseriti i documenti di claudio
</commit_message>
<xml_diff>
--- a/Documents/100%claudio/claude2024.docx
+++ b/Documents/100%claudio/claude2024.docx
@@ -4,66 +4,6 @@
   <w:body>
     <w:p>
       <w:pPr>
-        <w:pStyle w:val="Heading1"/>
-        <w:keepNext w:val="0"/>
-        <w:keepLines w:val="0"/>
-        <w:spacing w:before="480" w:lineRule="auto"/>
-        <w:rPr>
-          <w:b w:val="1"/>
-          <w:bCs w:val="1"/>
-          <w:sz w:val="46"/>
-          <w:szCs w:val="46"/>
-        </w:rPr>
-      </w:pPr>
-      <w:bookmarkStart w:colFirst="0" w:colLast="0" w:name="_sdl186n03e5m" w:id="0"/>
-      <w:bookmarkEnd w:id="0"/>
-      <w:r>
-        <w:rPr>
-          <w:b w:val="1"/>
-          <w:bCs w:val="1"/>
-          <w:sz w:val="46"/>
-          <w:szCs w:val="46"/>
-          <w:rtl w:val="0"/>
-        </w:rPr>
-        <w:t xml:space="preserve">Analisi WAMAS: Problemi Tecnici e Operativi</w:t>
-      </w:r>
-    </w:p>
-    <w:p>
-      <w:pPr>
-        <w:spacing w:after="240" w:before="240" w:lineRule="auto"/>
-        <w:rPr/>
-      </w:pPr>
-      <w:r>
-        <w:rPr>
-          <w:b w:val="1"/>
-          <w:bCs w:val="1"/>
-          <w:rtl w:val="0"/>
-        </w:rPr>
-        <w:t xml:space="preserve">Fonte:</w:t>
-      </w:r>
-      <w:r>
-        <w:rPr>
-          <w:rtl w:val="0"/>
-        </w:rPr>
-        <w:t xml:space="preserve"> Conversazioni WhatsApp esportate (2024_clean.pdf) </w:t>
-      </w:r>
-      <w:r>
-        <w:rPr>
-          <w:b w:val="1"/>
-          <w:bCs w:val="1"/>
-          <w:rtl w:val="0"/>
-        </w:rPr>
-        <w:t xml:space="preserve">Periodo analizzato:</w:t>
-      </w:r>
-      <w:r>
-        <w:rPr>
-          <w:rtl w:val="0"/>
-        </w:rPr>
-        <w:t xml:space="preserve"> 27/12/2023 – 19/12/2024</w:t>
-      </w:r>
-    </w:p>
-    <w:p>
-      <w:pPr>
         <w:rPr/>
       </w:pPr>
       <w:r>
@@ -90,8 +30,8 @@
           <w:szCs w:val="34"/>
         </w:rPr>
       </w:pPr>
-      <w:bookmarkStart w:colFirst="0" w:colLast="0" w:name="_zbn3s2kkvlf2" w:id="1"/>
-      <w:bookmarkEnd w:id="1"/>
+      <w:bookmarkStart w:colFirst="0" w:colLast="0" w:name="_zbn3s2kkvlf2" w:id="0"/>
+      <w:bookmarkEnd w:id="0"/>
       <w:r>
         <w:rPr>
           <w:b w:val="1"/>
@@ -193,8 +133,8 @@
           <w:szCs w:val="34"/>
         </w:rPr>
       </w:pPr>
-      <w:bookmarkStart w:colFirst="0" w:colLast="0" w:name="_i93c8muxl7fa" w:id="2"/>
-      <w:bookmarkEnd w:id="2"/>
+      <w:bookmarkStart w:colFirst="0" w:colLast="0" w:name="_i93c8muxl7fa" w:id="1"/>
+      <w:bookmarkEnd w:id="1"/>
       <w:r>
         <w:rPr>
           <w:b w:val="1"/>
@@ -296,8 +236,8 @@
           <w:szCs w:val="34"/>
         </w:rPr>
       </w:pPr>
-      <w:bookmarkStart w:colFirst="0" w:colLast="0" w:name="_b978yazfco1v" w:id="3"/>
-      <w:bookmarkEnd w:id="3"/>
+      <w:bookmarkStart w:colFirst="0" w:colLast="0" w:name="_b978yazfco1v" w:id="2"/>
+      <w:bookmarkEnd w:id="2"/>
       <w:r>
         <w:rPr>
           <w:b w:val="1"/>
@@ -399,8 +339,8 @@
           <w:szCs w:val="34"/>
         </w:rPr>
       </w:pPr>
-      <w:bookmarkStart w:colFirst="0" w:colLast="0" w:name="_snocyubs9yh6" w:id="4"/>
-      <w:bookmarkEnd w:id="4"/>
+      <w:bookmarkStart w:colFirst="0" w:colLast="0" w:name="_snocyubs9yh6" w:id="3"/>
+      <w:bookmarkEnd w:id="3"/>
       <w:r>
         <w:rPr>
           <w:b w:val="1"/>
@@ -503,8 +443,8 @@
           <w:szCs w:val="34"/>
         </w:rPr>
       </w:pPr>
-      <w:bookmarkStart w:colFirst="0" w:colLast="0" w:name="_fegb54fc3x00" w:id="5"/>
-      <w:bookmarkEnd w:id="5"/>
+      <w:bookmarkStart w:colFirst="0" w:colLast="0" w:name="_fegb54fc3x00" w:id="4"/>
+      <w:bookmarkEnd w:id="4"/>
       <w:r>
         <w:rPr>
           <w:b w:val="1"/>
@@ -606,8 +546,8 @@
           <w:szCs w:val="34"/>
         </w:rPr>
       </w:pPr>
-      <w:bookmarkStart w:colFirst="0" w:colLast="0" w:name="_rt8hs6rwsquj" w:id="6"/>
-      <w:bookmarkEnd w:id="6"/>
+      <w:bookmarkStart w:colFirst="0" w:colLast="0" w:name="_rt8hs6rwsquj" w:id="5"/>
+      <w:bookmarkEnd w:id="5"/>
       <w:r>
         <w:rPr>
           <w:b w:val="1"/>
@@ -709,8 +649,8 @@
           <w:szCs w:val="34"/>
         </w:rPr>
       </w:pPr>
-      <w:bookmarkStart w:colFirst="0" w:colLast="0" w:name="_diqlpdoc6cuk" w:id="7"/>
-      <w:bookmarkEnd w:id="7"/>
+      <w:bookmarkStart w:colFirst="0" w:colLast="0" w:name="_diqlpdoc6cuk" w:id="6"/>
+      <w:bookmarkEnd w:id="6"/>
       <w:r>
         <w:rPr>
           <w:b w:val="1"/>
@@ -854,8 +794,8 @@
           <w:szCs w:val="34"/>
         </w:rPr>
       </w:pPr>
-      <w:bookmarkStart w:colFirst="0" w:colLast="0" w:name="_tzor057p2ebl" w:id="8"/>
-      <w:bookmarkEnd w:id="8"/>
+      <w:bookmarkStart w:colFirst="0" w:colLast="0" w:name="_tzor057p2ebl" w:id="7"/>
+      <w:bookmarkEnd w:id="7"/>
       <w:r>
         <w:rPr>
           <w:b w:val="1"/>
@@ -957,8 +897,8 @@
           <w:szCs w:val="34"/>
         </w:rPr>
       </w:pPr>
-      <w:bookmarkStart w:colFirst="0" w:colLast="0" w:name="_rw61gcobyu7v" w:id="9"/>
-      <w:bookmarkEnd w:id="9"/>
+      <w:bookmarkStart w:colFirst="0" w:colLast="0" w:name="_rw61gcobyu7v" w:id="8"/>
+      <w:bookmarkEnd w:id="8"/>
       <w:r>
         <w:rPr>
           <w:b w:val="1"/>
@@ -1074,8 +1014,8 @@
           <w:szCs w:val="34"/>
         </w:rPr>
       </w:pPr>
-      <w:bookmarkStart w:colFirst="0" w:colLast="0" w:name="_fvt1vx9vsxo0" w:id="10"/>
-      <w:bookmarkEnd w:id="10"/>
+      <w:bookmarkStart w:colFirst="0" w:colLast="0" w:name="_fvt1vx9vsxo0" w:id="9"/>
+      <w:bookmarkEnd w:id="9"/>
       <w:r>
         <w:rPr>
           <w:b w:val="1"/>
@@ -1177,8 +1117,8 @@
           <w:szCs w:val="34"/>
         </w:rPr>
       </w:pPr>
-      <w:bookmarkStart w:colFirst="0" w:colLast="0" w:name="_y0zkx32wb52i" w:id="11"/>
-      <w:bookmarkEnd w:id="11"/>
+      <w:bookmarkStart w:colFirst="0" w:colLast="0" w:name="_y0zkx32wb52i" w:id="10"/>
+      <w:bookmarkEnd w:id="10"/>
       <w:r>
         <w:rPr>
           <w:b w:val="1"/>
@@ -1280,8 +1220,8 @@
           <w:szCs w:val="34"/>
         </w:rPr>
       </w:pPr>
-      <w:bookmarkStart w:colFirst="0" w:colLast="0" w:name="_it7s0pvhwxzz" w:id="12"/>
-      <w:bookmarkEnd w:id="12"/>
+      <w:bookmarkStart w:colFirst="0" w:colLast="0" w:name="_it7s0pvhwxzz" w:id="11"/>
+      <w:bookmarkEnd w:id="11"/>
       <w:r>
         <w:rPr>
           <w:b w:val="1"/>
@@ -1383,8 +1323,8 @@
           <w:szCs w:val="34"/>
         </w:rPr>
       </w:pPr>
-      <w:bookmarkStart w:colFirst="0" w:colLast="0" w:name="_mhkp5ydnpzoe" w:id="13"/>
-      <w:bookmarkEnd w:id="13"/>
+      <w:bookmarkStart w:colFirst="0" w:colLast="0" w:name="_mhkp5ydnpzoe" w:id="12"/>
+      <w:bookmarkEnd w:id="12"/>
       <w:r>
         <w:rPr>
           <w:b w:val="1"/>
@@ -1486,8 +1426,8 @@
           <w:szCs w:val="34"/>
         </w:rPr>
       </w:pPr>
-      <w:bookmarkStart w:colFirst="0" w:colLast="0" w:name="_7kbhusqb7fvn" w:id="14"/>
-      <w:bookmarkEnd w:id="14"/>
+      <w:bookmarkStart w:colFirst="0" w:colLast="0" w:name="_7kbhusqb7fvn" w:id="13"/>
+      <w:bookmarkEnd w:id="13"/>
       <w:r>
         <w:rPr>
           <w:b w:val="1"/>
@@ -1589,8 +1529,8 @@
           <w:szCs w:val="34"/>
         </w:rPr>
       </w:pPr>
-      <w:bookmarkStart w:colFirst="0" w:colLast="0" w:name="_6509lty033c0" w:id="15"/>
-      <w:bookmarkEnd w:id="15"/>
+      <w:bookmarkStart w:colFirst="0" w:colLast="0" w:name="_6509lty033c0" w:id="14"/>
+      <w:bookmarkEnd w:id="14"/>
       <w:r>
         <w:rPr>
           <w:b w:val="1"/>
@@ -1693,8 +1633,8 @@
           <w:szCs w:val="34"/>
         </w:rPr>
       </w:pPr>
-      <w:bookmarkStart w:colFirst="0" w:colLast="0" w:name="_gmye7g6cqlt7" w:id="16"/>
-      <w:bookmarkEnd w:id="16"/>
+      <w:bookmarkStart w:colFirst="0" w:colLast="0" w:name="_gmye7g6cqlt7" w:id="15"/>
+      <w:bookmarkEnd w:id="15"/>
       <w:r>
         <w:rPr>
           <w:b w:val="1"/>
@@ -1796,8 +1736,8 @@
           <w:szCs w:val="34"/>
         </w:rPr>
       </w:pPr>
-      <w:bookmarkStart w:colFirst="0" w:colLast="0" w:name="_oim54d61mp8r" w:id="17"/>
-      <w:bookmarkEnd w:id="17"/>
+      <w:bookmarkStart w:colFirst="0" w:colLast="0" w:name="_oim54d61mp8r" w:id="16"/>
+      <w:bookmarkEnd w:id="16"/>
       <w:r>
         <w:rPr>
           <w:b w:val="1"/>
@@ -1899,8 +1839,8 @@
           <w:szCs w:val="34"/>
         </w:rPr>
       </w:pPr>
-      <w:bookmarkStart w:colFirst="0" w:colLast="0" w:name="_lkq4bgx253jg" w:id="18"/>
-      <w:bookmarkEnd w:id="18"/>
+      <w:bookmarkStart w:colFirst="0" w:colLast="0" w:name="_lkq4bgx253jg" w:id="17"/>
+      <w:bookmarkEnd w:id="17"/>
       <w:r>
         <w:rPr>
           <w:b w:val="1"/>
@@ -2002,8 +1942,8 @@
           <w:szCs w:val="34"/>
         </w:rPr>
       </w:pPr>
-      <w:bookmarkStart w:colFirst="0" w:colLast="0" w:name="_w7xlw7gotrsh" w:id="19"/>
-      <w:bookmarkEnd w:id="19"/>
+      <w:bookmarkStart w:colFirst="0" w:colLast="0" w:name="_w7xlw7gotrsh" w:id="18"/>
+      <w:bookmarkEnd w:id="18"/>
       <w:r>
         <w:rPr>
           <w:b w:val="1"/>
@@ -2105,8 +2045,8 @@
           <w:szCs w:val="34"/>
         </w:rPr>
       </w:pPr>
-      <w:bookmarkStart w:colFirst="0" w:colLast="0" w:name="_g7pptjuluz5" w:id="20"/>
-      <w:bookmarkEnd w:id="20"/>
+      <w:bookmarkStart w:colFirst="0" w:colLast="0" w:name="_g7pptjuluz5" w:id="19"/>
+      <w:bookmarkEnd w:id="19"/>
       <w:r>
         <w:rPr>
           <w:b w:val="1"/>
@@ -2236,8 +2176,8 @@
           <w:szCs w:val="34"/>
         </w:rPr>
       </w:pPr>
-      <w:bookmarkStart w:colFirst="0" w:colLast="0" w:name="_h196iuj5d0zi" w:id="21"/>
-      <w:bookmarkEnd w:id="21"/>
+      <w:bookmarkStart w:colFirst="0" w:colLast="0" w:name="_h196iuj5d0zi" w:id="20"/>
+      <w:bookmarkEnd w:id="20"/>
       <w:r>
         <w:rPr>
           <w:b w:val="1"/>
@@ -2339,8 +2279,8 @@
           <w:szCs w:val="34"/>
         </w:rPr>
       </w:pPr>
-      <w:bookmarkStart w:colFirst="0" w:colLast="0" w:name="_q3y1pqvg0dxu" w:id="22"/>
-      <w:bookmarkEnd w:id="22"/>
+      <w:bookmarkStart w:colFirst="0" w:colLast="0" w:name="_q3y1pqvg0dxu" w:id="21"/>
+      <w:bookmarkEnd w:id="21"/>
       <w:r>
         <w:rPr>
           <w:b w:val="1"/>
@@ -2442,8 +2382,8 @@
           <w:szCs w:val="34"/>
         </w:rPr>
       </w:pPr>
-      <w:bookmarkStart w:colFirst="0" w:colLast="0" w:name="_icmbpk2xehq1" w:id="23"/>
-      <w:bookmarkEnd w:id="23"/>
+      <w:bookmarkStart w:colFirst="0" w:colLast="0" w:name="_icmbpk2xehq1" w:id="22"/>
+      <w:bookmarkEnd w:id="22"/>
       <w:r>
         <w:rPr>
           <w:b w:val="1"/>
@@ -2531,8 +2471,8 @@
           <w:szCs w:val="34"/>
         </w:rPr>
       </w:pPr>
-      <w:bookmarkStart w:colFirst="0" w:colLast="0" w:name="_7lm07vbxhl4p" w:id="24"/>
-      <w:bookmarkEnd w:id="24"/>
+      <w:bookmarkStart w:colFirst="0" w:colLast="0" w:name="_7lm07vbxhl4p" w:id="23"/>
+      <w:bookmarkEnd w:id="23"/>
       <w:r>
         <w:rPr>
           <w:b w:val="1"/>
@@ -2634,8 +2574,8 @@
           <w:szCs w:val="34"/>
         </w:rPr>
       </w:pPr>
-      <w:bookmarkStart w:colFirst="0" w:colLast="0" w:name="_v3p1prjcrjf" w:id="25"/>
-      <w:bookmarkEnd w:id="25"/>
+      <w:bookmarkStart w:colFirst="0" w:colLast="0" w:name="_v3p1prjcrjf" w:id="24"/>
+      <w:bookmarkEnd w:id="24"/>
       <w:r>
         <w:rPr>
           <w:b w:val="1"/>
@@ -2738,8 +2678,8 @@
           <w:szCs w:val="34"/>
         </w:rPr>
       </w:pPr>
-      <w:bookmarkStart w:colFirst="0" w:colLast="0" w:name="_qnjp1vvbj2q7" w:id="26"/>
-      <w:bookmarkEnd w:id="26"/>
+      <w:bookmarkStart w:colFirst="0" w:colLast="0" w:name="_qnjp1vvbj2q7" w:id="25"/>
+      <w:bookmarkEnd w:id="25"/>
       <w:r>
         <w:rPr>
           <w:b w:val="1"/>
@@ -2841,8 +2781,8 @@
           <w:szCs w:val="34"/>
         </w:rPr>
       </w:pPr>
-      <w:bookmarkStart w:colFirst="0" w:colLast="0" w:name="_q5ebyopk93k0" w:id="27"/>
-      <w:bookmarkEnd w:id="27"/>
+      <w:bookmarkStart w:colFirst="0" w:colLast="0" w:name="_q5ebyopk93k0" w:id="26"/>
+      <w:bookmarkEnd w:id="26"/>
       <w:r>
         <w:rPr>
           <w:b w:val="1"/>
@@ -2944,8 +2884,8 @@
           <w:szCs w:val="34"/>
         </w:rPr>
       </w:pPr>
-      <w:bookmarkStart w:colFirst="0" w:colLast="0" w:name="_hpd6xgy19cxs" w:id="28"/>
-      <w:bookmarkEnd w:id="28"/>
+      <w:bookmarkStart w:colFirst="0" w:colLast="0" w:name="_hpd6xgy19cxs" w:id="27"/>
+      <w:bookmarkEnd w:id="27"/>
       <w:r>
         <w:rPr>
           <w:b w:val="1"/>
@@ -3047,8 +2987,8 @@
           <w:szCs w:val="34"/>
         </w:rPr>
       </w:pPr>
-      <w:bookmarkStart w:colFirst="0" w:colLast="0" w:name="_319ekmn6as7p" w:id="29"/>
-      <w:bookmarkEnd w:id="29"/>
+      <w:bookmarkStart w:colFirst="0" w:colLast="0" w:name="_319ekmn6as7p" w:id="28"/>
+      <w:bookmarkEnd w:id="28"/>
       <w:r>
         <w:rPr>
           <w:b w:val="1"/>
@@ -3150,8 +3090,8 @@
           <w:szCs w:val="34"/>
         </w:rPr>
       </w:pPr>
-      <w:bookmarkStart w:colFirst="0" w:colLast="0" w:name="_8dcabcu6580r" w:id="30"/>
-      <w:bookmarkEnd w:id="30"/>
+      <w:bookmarkStart w:colFirst="0" w:colLast="0" w:name="_8dcabcu6580r" w:id="29"/>
+      <w:bookmarkEnd w:id="29"/>
       <w:r>
         <w:rPr>
           <w:b w:val="1"/>
@@ -3253,8 +3193,8 @@
           <w:szCs w:val="34"/>
         </w:rPr>
       </w:pPr>
-      <w:bookmarkStart w:colFirst="0" w:colLast="0" w:name="_506rg299zwdq" w:id="31"/>
-      <w:bookmarkEnd w:id="31"/>
+      <w:bookmarkStart w:colFirst="0" w:colLast="0" w:name="_506rg299zwdq" w:id="30"/>
+      <w:bookmarkEnd w:id="30"/>
       <w:r>
         <w:rPr>
           <w:b w:val="1"/>
@@ -3356,8 +3296,8 @@
           <w:szCs w:val="34"/>
         </w:rPr>
       </w:pPr>
-      <w:bookmarkStart w:colFirst="0" w:colLast="0" w:name="_qqxk578op3mv" w:id="32"/>
-      <w:bookmarkEnd w:id="32"/>
+      <w:bookmarkStart w:colFirst="0" w:colLast="0" w:name="_qqxk578op3mv" w:id="31"/>
+      <w:bookmarkEnd w:id="31"/>
       <w:r>
         <w:rPr>
           <w:b w:val="1"/>
@@ -3473,8 +3413,8 @@
           <w:szCs w:val="34"/>
         </w:rPr>
       </w:pPr>
-      <w:bookmarkStart w:colFirst="0" w:colLast="0" w:name="_bdz5ei1lrls" w:id="33"/>
-      <w:bookmarkEnd w:id="33"/>
+      <w:bookmarkStart w:colFirst="0" w:colLast="0" w:name="_bdz5ei1lrls" w:id="32"/>
+      <w:bookmarkEnd w:id="32"/>
       <w:r>
         <w:rPr>
           <w:b w:val="1"/>
@@ -3576,8 +3516,8 @@
           <w:szCs w:val="34"/>
         </w:rPr>
       </w:pPr>
-      <w:bookmarkStart w:colFirst="0" w:colLast="0" w:name="_qqt82y65rsol" w:id="34"/>
-      <w:bookmarkEnd w:id="34"/>
+      <w:bookmarkStart w:colFirst="0" w:colLast="0" w:name="_qqt82y65rsol" w:id="33"/>
+      <w:bookmarkEnd w:id="33"/>
       <w:r>
         <w:rPr>
           <w:b w:val="1"/>
@@ -3679,8 +3619,8 @@
           <w:szCs w:val="34"/>
         </w:rPr>
       </w:pPr>
-      <w:bookmarkStart w:colFirst="0" w:colLast="0" w:name="_gb3fjyex2itc" w:id="35"/>
-      <w:bookmarkEnd w:id="35"/>
+      <w:bookmarkStart w:colFirst="0" w:colLast="0" w:name="_gb3fjyex2itc" w:id="34"/>
+      <w:bookmarkEnd w:id="34"/>
       <w:r>
         <w:rPr>
           <w:b w:val="1"/>
@@ -3782,8 +3722,8 @@
           <w:szCs w:val="34"/>
         </w:rPr>
       </w:pPr>
-      <w:bookmarkStart w:colFirst="0" w:colLast="0" w:name="_mo9uq75m8wg6" w:id="36"/>
-      <w:bookmarkEnd w:id="36"/>
+      <w:bookmarkStart w:colFirst="0" w:colLast="0" w:name="_mo9uq75m8wg6" w:id="35"/>
+      <w:bookmarkEnd w:id="35"/>
       <w:r>
         <w:rPr>
           <w:b w:val="1"/>
@@ -3885,8 +3825,8 @@
           <w:szCs w:val="34"/>
         </w:rPr>
       </w:pPr>
-      <w:bookmarkStart w:colFirst="0" w:colLast="0" w:name="_562tc0ecb2vx" w:id="37"/>
-      <w:bookmarkEnd w:id="37"/>
+      <w:bookmarkStart w:colFirst="0" w:colLast="0" w:name="_562tc0ecb2vx" w:id="36"/>
+      <w:bookmarkEnd w:id="36"/>
       <w:r>
         <w:rPr>
           <w:b w:val="1"/>
@@ -3988,8 +3928,8 @@
           <w:szCs w:val="34"/>
         </w:rPr>
       </w:pPr>
-      <w:bookmarkStart w:colFirst="0" w:colLast="0" w:name="_g58gevcz0csr" w:id="38"/>
-      <w:bookmarkEnd w:id="38"/>
+      <w:bookmarkStart w:colFirst="0" w:colLast="0" w:name="_g58gevcz0csr" w:id="37"/>
+      <w:bookmarkEnd w:id="37"/>
       <w:r>
         <w:rPr>
           <w:b w:val="1"/>
@@ -4091,8 +4031,8 @@
           <w:szCs w:val="34"/>
         </w:rPr>
       </w:pPr>
-      <w:bookmarkStart w:colFirst="0" w:colLast="0" w:name="_sphuv4s724ak" w:id="39"/>
-      <w:bookmarkEnd w:id="39"/>
+      <w:bookmarkStart w:colFirst="0" w:colLast="0" w:name="_sphuv4s724ak" w:id="38"/>
+      <w:bookmarkEnd w:id="38"/>
       <w:r>
         <w:rPr>
           <w:b w:val="1"/>
@@ -4194,8 +4134,8 @@
           <w:szCs w:val="34"/>
         </w:rPr>
       </w:pPr>
-      <w:bookmarkStart w:colFirst="0" w:colLast="0" w:name="_wue8gvei3s0c" w:id="40"/>
-      <w:bookmarkEnd w:id="40"/>
+      <w:bookmarkStart w:colFirst="0" w:colLast="0" w:name="_wue8gvei3s0c" w:id="39"/>
+      <w:bookmarkEnd w:id="39"/>
       <w:r>
         <w:rPr>
           <w:b w:val="1"/>
@@ -4297,8 +4237,8 @@
           <w:szCs w:val="34"/>
         </w:rPr>
       </w:pPr>
-      <w:bookmarkStart w:colFirst="0" w:colLast="0" w:name="_1rtvypacwuug" w:id="41"/>
-      <w:bookmarkEnd w:id="41"/>
+      <w:bookmarkStart w:colFirst="0" w:colLast="0" w:name="_1rtvypacwuug" w:id="40"/>
+      <w:bookmarkEnd w:id="40"/>
       <w:r>
         <w:rPr>
           <w:b w:val="1"/>
@@ -4400,8 +4340,8 @@
           <w:szCs w:val="34"/>
         </w:rPr>
       </w:pPr>
-      <w:bookmarkStart w:colFirst="0" w:colLast="0" w:name="_mp7idvy0oz1g" w:id="42"/>
-      <w:bookmarkEnd w:id="42"/>
+      <w:bookmarkStart w:colFirst="0" w:colLast="0" w:name="_mp7idvy0oz1g" w:id="41"/>
+      <w:bookmarkEnd w:id="41"/>
       <w:r>
         <w:rPr>
           <w:b w:val="1"/>
@@ -4503,8 +4443,8 @@
           <w:szCs w:val="34"/>
         </w:rPr>
       </w:pPr>
-      <w:bookmarkStart w:colFirst="0" w:colLast="0" w:name="_keq8w321a9e0" w:id="43"/>
-      <w:bookmarkEnd w:id="43"/>
+      <w:bookmarkStart w:colFirst="0" w:colLast="0" w:name="_keq8w321a9e0" w:id="42"/>
+      <w:bookmarkEnd w:id="42"/>
       <w:r>
         <w:rPr>
           <w:b w:val="1"/>
@@ -4606,8 +4546,8 @@
           <w:szCs w:val="34"/>
         </w:rPr>
       </w:pPr>
-      <w:bookmarkStart w:colFirst="0" w:colLast="0" w:name="_vvpx1e1fl44h" w:id="44"/>
-      <w:bookmarkEnd w:id="44"/>
+      <w:bookmarkStart w:colFirst="0" w:colLast="0" w:name="_vvpx1e1fl44h" w:id="43"/>
+      <w:bookmarkEnd w:id="43"/>
       <w:r>
         <w:rPr>
           <w:b w:val="1"/>
@@ -4709,8 +4649,8 @@
           <w:szCs w:val="34"/>
         </w:rPr>
       </w:pPr>
-      <w:bookmarkStart w:colFirst="0" w:colLast="0" w:name="_goznjcqilh5h" w:id="45"/>
-      <w:bookmarkEnd w:id="45"/>
+      <w:bookmarkStart w:colFirst="0" w:colLast="0" w:name="_goznjcqilh5h" w:id="44"/>
+      <w:bookmarkEnd w:id="44"/>
       <w:r>
         <w:rPr>
           <w:b w:val="1"/>
@@ -4812,8 +4752,8 @@
           <w:szCs w:val="34"/>
         </w:rPr>
       </w:pPr>
-      <w:bookmarkStart w:colFirst="0" w:colLast="0" w:name="_x7gi376xnjhs" w:id="46"/>
-      <w:bookmarkEnd w:id="46"/>
+      <w:bookmarkStart w:colFirst="0" w:colLast="0" w:name="_x7gi376xnjhs" w:id="45"/>
+      <w:bookmarkEnd w:id="45"/>
       <w:r>
         <w:rPr>
           <w:b w:val="1"/>
@@ -4930,8 +4870,8 @@
           <w:szCs w:val="34"/>
         </w:rPr>
       </w:pPr>
-      <w:bookmarkStart w:colFirst="0" w:colLast="0" w:name="_q9eaqvbawjra" w:id="47"/>
-      <w:bookmarkEnd w:id="47"/>
+      <w:bookmarkStart w:colFirst="0" w:colLast="0" w:name="_q9eaqvbawjra" w:id="46"/>
+      <w:bookmarkEnd w:id="46"/>
       <w:r>
         <w:rPr>
           <w:b w:val="1"/>
@@ -5034,8 +4974,8 @@
           <w:szCs w:val="34"/>
         </w:rPr>
       </w:pPr>
-      <w:bookmarkStart w:colFirst="0" w:colLast="0" w:name="_qswenpw4ykac" w:id="48"/>
-      <w:bookmarkEnd w:id="48"/>
+      <w:bookmarkStart w:colFirst="0" w:colLast="0" w:name="_qswenpw4ykac" w:id="47"/>
+      <w:bookmarkEnd w:id="47"/>
       <w:r>
         <w:rPr>
           <w:b w:val="1"/>
@@ -5137,8 +5077,8 @@
           <w:szCs w:val="34"/>
         </w:rPr>
       </w:pPr>
-      <w:bookmarkStart w:colFirst="0" w:colLast="0" w:name="_gqd8r2rsnphu" w:id="49"/>
-      <w:bookmarkEnd w:id="49"/>
+      <w:bookmarkStart w:colFirst="0" w:colLast="0" w:name="_gqd8r2rsnphu" w:id="48"/>
+      <w:bookmarkEnd w:id="48"/>
       <w:r>
         <w:rPr>
           <w:b w:val="1"/>
@@ -5241,8 +5181,8 @@
           <w:szCs w:val="34"/>
         </w:rPr>
       </w:pPr>
-      <w:bookmarkStart w:colFirst="0" w:colLast="0" w:name="_8nndpoueovcn" w:id="50"/>
-      <w:bookmarkEnd w:id="50"/>
+      <w:bookmarkStart w:colFirst="0" w:colLast="0" w:name="_8nndpoueovcn" w:id="49"/>
+      <w:bookmarkEnd w:id="49"/>
       <w:r>
         <w:rPr>
           <w:b w:val="1"/>
@@ -5344,8 +5284,8 @@
           <w:szCs w:val="34"/>
         </w:rPr>
       </w:pPr>
-      <w:bookmarkStart w:colFirst="0" w:colLast="0" w:name="_kuailtcl7vva" w:id="51"/>
-      <w:bookmarkEnd w:id="51"/>
+      <w:bookmarkStart w:colFirst="0" w:colLast="0" w:name="_kuailtcl7vva" w:id="50"/>
+      <w:bookmarkEnd w:id="50"/>
       <w:r>
         <w:rPr>
           <w:b w:val="1"/>
@@ -5447,8 +5387,8 @@
           <w:szCs w:val="34"/>
         </w:rPr>
       </w:pPr>
-      <w:bookmarkStart w:colFirst="0" w:colLast="0" w:name="_18d972uzio02" w:id="52"/>
-      <w:bookmarkEnd w:id="52"/>
+      <w:bookmarkStart w:colFirst="0" w:colLast="0" w:name="_18d972uzio02" w:id="51"/>
+      <w:bookmarkEnd w:id="51"/>
       <w:r>
         <w:rPr>
           <w:b w:val="1"/>
@@ -5550,8 +5490,8 @@
           <w:szCs w:val="34"/>
         </w:rPr>
       </w:pPr>
-      <w:bookmarkStart w:colFirst="0" w:colLast="0" w:name="_yl32nv76pinw" w:id="53"/>
-      <w:bookmarkEnd w:id="53"/>
+      <w:bookmarkStart w:colFirst="0" w:colLast="0" w:name="_yl32nv76pinw" w:id="52"/>
+      <w:bookmarkEnd w:id="52"/>
       <w:r>
         <w:rPr>
           <w:b w:val="1"/>
@@ -5653,8 +5593,8 @@
           <w:szCs w:val="34"/>
         </w:rPr>
       </w:pPr>
-      <w:bookmarkStart w:colFirst="0" w:colLast="0" w:name="_487ane4ivx8" w:id="54"/>
-      <w:bookmarkEnd w:id="54"/>
+      <w:bookmarkStart w:colFirst="0" w:colLast="0" w:name="_487ane4ivx8" w:id="53"/>
+      <w:bookmarkEnd w:id="53"/>
       <w:r>
         <w:rPr>
           <w:b w:val="1"/>
@@ -5784,8 +5724,8 @@
           <w:szCs w:val="34"/>
         </w:rPr>
       </w:pPr>
-      <w:bookmarkStart w:colFirst="0" w:colLast="0" w:name="_i0safi59zdgb" w:id="55"/>
-      <w:bookmarkEnd w:id="55"/>
+      <w:bookmarkStart w:colFirst="0" w:colLast="0" w:name="_i0safi59zdgb" w:id="54"/>
+      <w:bookmarkEnd w:id="54"/>
       <w:r>
         <w:rPr>
           <w:b w:val="1"/>
@@ -5887,8 +5827,8 @@
           <w:szCs w:val="34"/>
         </w:rPr>
       </w:pPr>
-      <w:bookmarkStart w:colFirst="0" w:colLast="0" w:name="_15hir8gzthuy" w:id="56"/>
-      <w:bookmarkEnd w:id="56"/>
+      <w:bookmarkStart w:colFirst="0" w:colLast="0" w:name="_15hir8gzthuy" w:id="55"/>
+      <w:bookmarkEnd w:id="55"/>
       <w:r>
         <w:rPr>
           <w:b w:val="1"/>
@@ -5976,8 +5916,8 @@
           <w:szCs w:val="34"/>
         </w:rPr>
       </w:pPr>
-      <w:bookmarkStart w:colFirst="0" w:colLast="0" w:name="_7n4jq6jtlruq" w:id="57"/>
-      <w:bookmarkEnd w:id="57"/>
+      <w:bookmarkStart w:colFirst="0" w:colLast="0" w:name="_7n4jq6jtlruq" w:id="56"/>
+      <w:bookmarkEnd w:id="56"/>
       <w:r>
         <w:rPr>
           <w:b w:val="1"/>
@@ -6065,8 +6005,8 @@
           <w:szCs w:val="34"/>
         </w:rPr>
       </w:pPr>
-      <w:bookmarkStart w:colFirst="0" w:colLast="0" w:name="_f3wqwimhcqrp" w:id="58"/>
-      <w:bookmarkEnd w:id="58"/>
+      <w:bookmarkStart w:colFirst="0" w:colLast="0" w:name="_f3wqwimhcqrp" w:id="57"/>
+      <w:bookmarkEnd w:id="57"/>
       <w:r>
         <w:rPr>
           <w:b w:val="1"/>
@@ -6168,8 +6108,8 @@
           <w:szCs w:val="34"/>
         </w:rPr>
       </w:pPr>
-      <w:bookmarkStart w:colFirst="0" w:colLast="0" w:name="_389h6lp4dyax" w:id="59"/>
-      <w:bookmarkEnd w:id="59"/>
+      <w:bookmarkStart w:colFirst="0" w:colLast="0" w:name="_389h6lp4dyax" w:id="58"/>
+      <w:bookmarkEnd w:id="58"/>
       <w:r>
         <w:rPr>
           <w:b w:val="1"/>
@@ -6257,8 +6197,8 @@
           <w:szCs w:val="34"/>
         </w:rPr>
       </w:pPr>
-      <w:bookmarkStart w:colFirst="0" w:colLast="0" w:name="_ww52g9en9oxg" w:id="60"/>
-      <w:bookmarkEnd w:id="60"/>
+      <w:bookmarkStart w:colFirst="0" w:colLast="0" w:name="_ww52g9en9oxg" w:id="59"/>
+      <w:bookmarkEnd w:id="59"/>
       <w:r>
         <w:rPr>
           <w:b w:val="1"/>
@@ -6360,8 +6300,8 @@
           <w:szCs w:val="34"/>
         </w:rPr>
       </w:pPr>
-      <w:bookmarkStart w:colFirst="0" w:colLast="0" w:name="_sx6h0j6s995q" w:id="61"/>
-      <w:bookmarkEnd w:id="61"/>
+      <w:bookmarkStart w:colFirst="0" w:colLast="0" w:name="_sx6h0j6s995q" w:id="60"/>
+      <w:bookmarkEnd w:id="60"/>
       <w:r>
         <w:rPr>
           <w:b w:val="1"/>
@@ -6463,8 +6403,8 @@
           <w:szCs w:val="34"/>
         </w:rPr>
       </w:pPr>
-      <w:bookmarkStart w:colFirst="0" w:colLast="0" w:name="_s4al4f2s9p57" w:id="62"/>
-      <w:bookmarkEnd w:id="62"/>
+      <w:bookmarkStart w:colFirst="0" w:colLast="0" w:name="_s4al4f2s9p57" w:id="61"/>
+      <w:bookmarkEnd w:id="61"/>
       <w:r>
         <w:rPr>
           <w:b w:val="1"/>
@@ -6566,8 +6506,8 @@
           <w:szCs w:val="34"/>
         </w:rPr>
       </w:pPr>
-      <w:bookmarkStart w:colFirst="0" w:colLast="0" w:name="_nvf5rpk0q63y" w:id="63"/>
-      <w:bookmarkEnd w:id="63"/>
+      <w:bookmarkStart w:colFirst="0" w:colLast="0" w:name="_nvf5rpk0q63y" w:id="62"/>
+      <w:bookmarkEnd w:id="62"/>
       <w:r>
         <w:rPr>
           <w:b w:val="1"/>
@@ -6669,8 +6609,8 @@
           <w:szCs w:val="34"/>
         </w:rPr>
       </w:pPr>
-      <w:bookmarkStart w:colFirst="0" w:colLast="0" w:name="_quaah2186mum" w:id="64"/>
-      <w:bookmarkEnd w:id="64"/>
+      <w:bookmarkStart w:colFirst="0" w:colLast="0" w:name="_quaah2186mum" w:id="63"/>
+      <w:bookmarkEnd w:id="63"/>
       <w:r>
         <w:rPr>
           <w:b w:val="1"/>
@@ -6772,8 +6712,8 @@
           <w:szCs w:val="34"/>
         </w:rPr>
       </w:pPr>
-      <w:bookmarkStart w:colFirst="0" w:colLast="0" w:name="_qrty1nbg5yyl" w:id="65"/>
-      <w:bookmarkEnd w:id="65"/>
+      <w:bookmarkStart w:colFirst="0" w:colLast="0" w:name="_qrty1nbg5yyl" w:id="64"/>
+      <w:bookmarkEnd w:id="64"/>
       <w:r>
         <w:rPr>
           <w:b w:val="1"/>
@@ -6875,8 +6815,8 @@
           <w:szCs w:val="34"/>
         </w:rPr>
       </w:pPr>
-      <w:bookmarkStart w:colFirst="0" w:colLast="0" w:name="_a8i5yro80mb7" w:id="66"/>
-      <w:bookmarkEnd w:id="66"/>
+      <w:bookmarkStart w:colFirst="0" w:colLast="0" w:name="_a8i5yro80mb7" w:id="65"/>
+      <w:bookmarkEnd w:id="65"/>
       <w:r>
         <w:rPr>
           <w:b w:val="1"/>
@@ -6978,8 +6918,8 @@
           <w:szCs w:val="34"/>
         </w:rPr>
       </w:pPr>
-      <w:bookmarkStart w:colFirst="0" w:colLast="0" w:name="_55ojp4hmfbbh" w:id="67"/>
-      <w:bookmarkEnd w:id="67"/>
+      <w:bookmarkStart w:colFirst="0" w:colLast="0" w:name="_55ojp4hmfbbh" w:id="66"/>
+      <w:bookmarkEnd w:id="66"/>
       <w:r>
         <w:rPr>
           <w:b w:val="1"/>
@@ -7081,8 +7021,8 @@
           <w:szCs w:val="34"/>
         </w:rPr>
       </w:pPr>
-      <w:bookmarkStart w:colFirst="0" w:colLast="0" w:name="_4j4dsrhgq5o3" w:id="68"/>
-      <w:bookmarkEnd w:id="68"/>
+      <w:bookmarkStart w:colFirst="0" w:colLast="0" w:name="_4j4dsrhgq5o3" w:id="67"/>
+      <w:bookmarkEnd w:id="67"/>
       <w:r>
         <w:rPr>
           <w:b w:val="1"/>
@@ -7185,8 +7125,8 @@
           <w:szCs w:val="34"/>
         </w:rPr>
       </w:pPr>
-      <w:bookmarkStart w:colFirst="0" w:colLast="0" w:name="_gnihoj7b4rkj" w:id="69"/>
-      <w:bookmarkEnd w:id="69"/>
+      <w:bookmarkStart w:colFirst="0" w:colLast="0" w:name="_gnihoj7b4rkj" w:id="68"/>
+      <w:bookmarkEnd w:id="68"/>
       <w:r>
         <w:rPr>
           <w:b w:val="1"/>
@@ -7288,8 +7228,8 @@
           <w:szCs w:val="34"/>
         </w:rPr>
       </w:pPr>
-      <w:bookmarkStart w:colFirst="0" w:colLast="0" w:name="_98dw2g2wlla2" w:id="70"/>
-      <w:bookmarkEnd w:id="70"/>
+      <w:bookmarkStart w:colFirst="0" w:colLast="0" w:name="_98dw2g2wlla2" w:id="69"/>
+      <w:bookmarkEnd w:id="69"/>
       <w:r>
         <w:rPr>
           <w:b w:val="1"/>
@@ -7391,8 +7331,8 @@
           <w:szCs w:val="34"/>
         </w:rPr>
       </w:pPr>
-      <w:bookmarkStart w:colFirst="0" w:colLast="0" w:name="_8h4c922dh0ra" w:id="71"/>
-      <w:bookmarkEnd w:id="71"/>
+      <w:bookmarkStart w:colFirst="0" w:colLast="0" w:name="_8h4c922dh0ra" w:id="70"/>
+      <w:bookmarkEnd w:id="70"/>
       <w:r>
         <w:rPr>
           <w:b w:val="1"/>
@@ -7494,8 +7434,8 @@
           <w:szCs w:val="34"/>
         </w:rPr>
       </w:pPr>
-      <w:bookmarkStart w:colFirst="0" w:colLast="0" w:name="_lg6lranjtz" w:id="72"/>
-      <w:bookmarkEnd w:id="72"/>
+      <w:bookmarkStart w:colFirst="0" w:colLast="0" w:name="_lg6lranjtz" w:id="71"/>
+      <w:bookmarkEnd w:id="71"/>
       <w:r>
         <w:rPr>
           <w:b w:val="1"/>
@@ -7625,8 +7565,8 @@
           <w:szCs w:val="34"/>
         </w:rPr>
       </w:pPr>
-      <w:bookmarkStart w:colFirst="0" w:colLast="0" w:name="_f87kkqvw27pd" w:id="73"/>
-      <w:bookmarkEnd w:id="73"/>
+      <w:bookmarkStart w:colFirst="0" w:colLast="0" w:name="_f87kkqvw27pd" w:id="72"/>
+      <w:bookmarkEnd w:id="72"/>
       <w:r>
         <w:rPr>
           <w:b w:val="1"/>
@@ -7728,8 +7668,8 @@
           <w:szCs w:val="34"/>
         </w:rPr>
       </w:pPr>
-      <w:bookmarkStart w:colFirst="0" w:colLast="0" w:name="_kgbcnw16jk8x" w:id="74"/>
-      <w:bookmarkEnd w:id="74"/>
+      <w:bookmarkStart w:colFirst="0" w:colLast="0" w:name="_kgbcnw16jk8x" w:id="73"/>
+      <w:bookmarkEnd w:id="73"/>
       <w:r>
         <w:rPr>
           <w:b w:val="1"/>
@@ -7831,8 +7771,8 @@
           <w:szCs w:val="34"/>
         </w:rPr>
       </w:pPr>
-      <w:bookmarkStart w:colFirst="0" w:colLast="0" w:name="_h98i8spckc92" w:id="75"/>
-      <w:bookmarkEnd w:id="75"/>
+      <w:bookmarkStart w:colFirst="0" w:colLast="0" w:name="_h98i8spckc92" w:id="74"/>
+      <w:bookmarkEnd w:id="74"/>
       <w:r>
         <w:rPr>
           <w:b w:val="1"/>
@@ -7934,8 +7874,8 @@
           <w:szCs w:val="34"/>
         </w:rPr>
       </w:pPr>
-      <w:bookmarkStart w:colFirst="0" w:colLast="0" w:name="_d98dpevss9qh" w:id="76"/>
-      <w:bookmarkEnd w:id="76"/>
+      <w:bookmarkStart w:colFirst="0" w:colLast="0" w:name="_d98dpevss9qh" w:id="75"/>
+      <w:bookmarkEnd w:id="75"/>
       <w:r>
         <w:rPr>
           <w:b w:val="1"/>
@@ -8037,8 +7977,8 @@
           <w:szCs w:val="34"/>
         </w:rPr>
       </w:pPr>
-      <w:bookmarkStart w:colFirst="0" w:colLast="0" w:name="_kh5nbxpd87r4" w:id="77"/>
-      <w:bookmarkEnd w:id="77"/>
+      <w:bookmarkStart w:colFirst="0" w:colLast="0" w:name="_kh5nbxpd87r4" w:id="76"/>
+      <w:bookmarkEnd w:id="76"/>
       <w:r>
         <w:rPr>
           <w:b w:val="1"/>
@@ -8140,8 +8080,8 @@
           <w:szCs w:val="34"/>
         </w:rPr>
       </w:pPr>
-      <w:bookmarkStart w:colFirst="0" w:colLast="0" w:name="_wc2ehb9h57rq" w:id="78"/>
-      <w:bookmarkEnd w:id="78"/>
+      <w:bookmarkStart w:colFirst="0" w:colLast="0" w:name="_wc2ehb9h57rq" w:id="77"/>
+      <w:bookmarkEnd w:id="77"/>
       <w:r>
         <w:rPr>
           <w:b w:val="1"/>
@@ -8243,8 +8183,8 @@
           <w:szCs w:val="34"/>
         </w:rPr>
       </w:pPr>
-      <w:bookmarkStart w:colFirst="0" w:colLast="0" w:name="_l43sia2sz27" w:id="79"/>
-      <w:bookmarkEnd w:id="79"/>
+      <w:bookmarkStart w:colFirst="0" w:colLast="0" w:name="_l43sia2sz27" w:id="78"/>
+      <w:bookmarkEnd w:id="78"/>
       <w:r>
         <w:rPr>
           <w:b w:val="1"/>
@@ -8346,8 +8286,8 @@
           <w:szCs w:val="34"/>
         </w:rPr>
       </w:pPr>
-      <w:bookmarkStart w:colFirst="0" w:colLast="0" w:name="_5ekz409z9hqk" w:id="80"/>
-      <w:bookmarkEnd w:id="80"/>
+      <w:bookmarkStart w:colFirst="0" w:colLast="0" w:name="_5ekz409z9hqk" w:id="79"/>
+      <w:bookmarkEnd w:id="79"/>
       <w:r>
         <w:rPr>
           <w:rFonts w:ascii="Arial Unicode MS" w:cs="Arial Unicode MS" w:eastAsia="Arial Unicode MS" w:hAnsi="Arial Unicode MS"/>
@@ -8450,8 +8390,8 @@
           <w:szCs w:val="34"/>
         </w:rPr>
       </w:pPr>
-      <w:bookmarkStart w:colFirst="0" w:colLast="0" w:name="_78mh7wldzwr0" w:id="81"/>
-      <w:bookmarkEnd w:id="81"/>
+      <w:bookmarkStart w:colFirst="0" w:colLast="0" w:name="_78mh7wldzwr0" w:id="80"/>
+      <w:bookmarkEnd w:id="80"/>
       <w:r>
         <w:rPr>
           <w:b w:val="1"/>
@@ -8553,8 +8493,8 @@
           <w:szCs w:val="34"/>
         </w:rPr>
       </w:pPr>
-      <w:bookmarkStart w:colFirst="0" w:colLast="0" w:name="_mvc7isbig01s" w:id="82"/>
-      <w:bookmarkEnd w:id="82"/>
+      <w:bookmarkStart w:colFirst="0" w:colLast="0" w:name="_mvc7isbig01s" w:id="81"/>
+      <w:bookmarkEnd w:id="81"/>
       <w:r>
         <w:rPr>
           <w:b w:val="1"/>
@@ -8656,8 +8596,8 @@
           <w:szCs w:val="34"/>
         </w:rPr>
       </w:pPr>
-      <w:bookmarkStart w:colFirst="0" w:colLast="0" w:name="_xp4dyjzaibnp" w:id="83"/>
-      <w:bookmarkEnd w:id="83"/>
+      <w:bookmarkStart w:colFirst="0" w:colLast="0" w:name="_xp4dyjzaibnp" w:id="82"/>
+      <w:bookmarkEnd w:id="82"/>
       <w:r>
         <w:rPr>
           <w:b w:val="1"/>
@@ -8759,8 +8699,8 @@
           <w:szCs w:val="34"/>
         </w:rPr>
       </w:pPr>
-      <w:bookmarkStart w:colFirst="0" w:colLast="0" w:name="_axun387clt1h" w:id="84"/>
-      <w:bookmarkEnd w:id="84"/>
+      <w:bookmarkStart w:colFirst="0" w:colLast="0" w:name="_axun387clt1h" w:id="83"/>
+      <w:bookmarkEnd w:id="83"/>
       <w:r>
         <w:rPr>
           <w:b w:val="1"/>
@@ -8862,8 +8802,8 @@
           <w:szCs w:val="34"/>
         </w:rPr>
       </w:pPr>
-      <w:bookmarkStart w:colFirst="0" w:colLast="0" w:name="_3g56k6guv6p0" w:id="85"/>
-      <w:bookmarkEnd w:id="85"/>
+      <w:bookmarkStart w:colFirst="0" w:colLast="0" w:name="_3g56k6guv6p0" w:id="84"/>
+      <w:bookmarkEnd w:id="84"/>
       <w:r>
         <w:rPr>
           <w:b w:val="1"/>
@@ -8965,8 +8905,8 @@
           <w:szCs w:val="34"/>
         </w:rPr>
       </w:pPr>
-      <w:bookmarkStart w:colFirst="0" w:colLast="0" w:name="_15xf2htnxh60" w:id="86"/>
-      <w:bookmarkEnd w:id="86"/>
+      <w:bookmarkStart w:colFirst="0" w:colLast="0" w:name="_15xf2htnxh60" w:id="85"/>
+      <w:bookmarkEnd w:id="85"/>
       <w:r>
         <w:rPr>
           <w:b w:val="1"/>
@@ -9042,7 +8982,10 @@
     </w:p>
     <w:p>
       <w:pPr>
-        <w:rPr/>
+        <w:rPr>
+          <w:i w:val="1"/>
+          <w:iCs w:val="1"/>
+        </w:rPr>
       </w:pPr>
       <w:r>
         <w:pict>
@@ -9053,23 +8996,6 @@
         <w:rPr>
           <w:rtl w:val="0"/>
         </w:rPr>
-      </w:r>
-    </w:p>
-    <w:p>
-      <w:pPr>
-        <w:spacing w:after="240" w:before="240" w:lineRule="auto"/>
-        <w:rPr>
-          <w:i w:val="1"/>
-          <w:iCs w:val="1"/>
-        </w:rPr>
-      </w:pPr>
-      <w:r>
-        <w:rPr>
-          <w:i w:val="1"/>
-          <w:iCs w:val="1"/>
-          <w:rtl w:val="0"/>
-        </w:rPr>
-        <w:t xml:space="preserve">Fine analisi – 117 pagine di chat analizzate, periodo 27/12/2023–19/12/2024</w:t>
       </w:r>
     </w:p>
     <w:p>

</xml_diff>